<commit_message>
Recria Ads: deixa claro que as horas por semana são para criar conteúdo
Co-Authored-By: Claude Opus 5.5 <noreply@anthropic.com>
Claude-Session: https://claude.ai/code/session_01RDM8d5cVD9w4uwiMSyLkgt
</commit_message>
<xml_diff>
--- a/agencia-recria/cursos/recria-ads/materiais/Ficha Meu cenario - em branco (editavel).docx
+++ b/agencia-recria/cursos/recria-ads/materiais/Ficha Meu cenario - em branco (editavel).docx
@@ -95,7 +95,7 @@
           <w:b/>
           <w:color w:val="9A7424"/>
         </w:rPr>
-        <w:t>8. Quantas horas por semana você tem para conteúdo?</w:t>
+        <w:t>8. Quantas horas por semana você consegue dedicar a criar conteúdo (pensar, escrever, gravar, editar e postar)?</w:t>
       </w:r>
     </w:p>
     <w:p/>
@@ -150,9 +150,7 @@
     </w:p>
     <w:p/>
     <w:p>
-      <w:r>
-        <w:br w:type="page"/>
-      </w:r>
+      <w:r/>
     </w:p>
     <w:p>
       <w:r>
@@ -262,7 +260,7 @@
           <w:rFonts w:ascii="Courier New" w:hAnsi="Courier New"/>
           <w:sz w:val="21"/>
         </w:rPr>
-        <w:t>- Tenho [X] horas por semana. Marque com ⭐ as ideias prioritárias que cabem nesse tempo.</w:t>
+        <w:t>- Tenho [X] horas por semana para criar conteúdo (pensar, gravar, editar e postar). Marque com ⭐ as ideias prioritárias que cabem nesse tempo.</w:t>
       </w:r>
     </w:p>
     <w:p>

</xml_diff>